<commit_message>
S6: cellar-rats float re-anchored and sized to clear the bottom margin
Co-Authored-By: Claude Opus 4.8 <noreply@anthropic.com>
</commit_message>
<xml_diff>
--- a/sessions/session_06_wraithpine.docx
+++ b/sessions/session_06_wraithpine.docx
@@ -1462,46 +1462,6 @@
     </w:p>
     <w:p>
       <w:pPr>
-        <w:pBdr>
-          <w:left w:val="single" w:sz="18" w:space="12" w:color="5B2A86"/>
-        </w:pBdr>
-        <w:shd w:val="clear" w:color="auto" w:fill="F4F0FA"/>
-        <w:spacing w:before="30" w:after="70"/>
-        <w:ind w:left="340" w:right="340"/>
-      </w:pPr>
-      <w:r>
-        <w:rPr>
-          <w:rFonts w:ascii="Georgia" w:hAnsi="Georgia" w:cs="Georgia"/>
-          <w:b w:val="0"/>
-          <w:i w:val="0"/>
-          <w:color w:val="222222"/>
-          <w:sz w:val="19"/>
-        </w:rPr>
-        <w:t xml:space="preserve">▶ </w:t>
-      </w:r>
-      <w:r>
-        <w:rPr>
-          <w:rFonts w:ascii="Georgia" w:hAnsi="Georgia" w:cs="Georgia"/>
-          <w:b/>
-          <w:i w:val="0"/>
-          <w:color w:val="222222"/>
-          <w:sz w:val="19"/>
-        </w:rPr>
-        <w:t>Cellar toys.</w:t>
-      </w:r>
-      <w:r>
-        <w:rPr>
-          <w:rFonts w:ascii="Georgia" w:hAnsi="Georgia" w:cs="Georgia"/>
-          <w:b w:val="0"/>
-          <w:i w:val="0"/>
-          <w:color w:val="222222"/>
-          <w:sz w:val="19"/>
-        </w:rPr>
-        <w:t xml:space="preserve"> Shove a shoulder-high cask down the tight aisle (once, Strength DC 12): 1d4 bludgeoning and prone to whatever fails a DC 12 Dexterity save. Pull down the rickety shelf (an Action): an adjacent creature makes a DC 13 Dexterity save or is restrained under broken wood until the end of its next turn.</w:t>
-      </w:r>
-    </w:p>
-    <w:p>
-      <w:pPr>
         <w:spacing w:after="0" w:before="0"/>
       </w:pPr>
       <w:r>
@@ -1514,7 +1474,7 @@
             <wp:positionV relativeFrom="paragraph">
               <wp:posOffset>0</wp:posOffset>
             </wp:positionV>
-            <wp:extent cx="3017520" cy="3017520"/>
+            <wp:extent cx="2834640" cy="2834640"/>
             <wp:effectExtent l="0" t="0" r="0" b="0"/>
             <wp:wrapSquare wrapText="bothSides"/>
             <wp:docPr id="5" name="Picture 5"/>
@@ -1535,7 +1495,7 @@
                   <pic:spPr>
                     <a:xfrm>
                       <a:off x="0" y="0"/>
-                      <a:ext cx="3017520" cy="3017520"/>
+                      <a:ext cx="2834640" cy="2834640"/>
                     </a:xfrm>
                     <a:prstGeom prst="rect"/>
                   </pic:spPr>
@@ -1544,6 +1504,46 @@
             </a:graphic>
           </wp:anchor>
         </w:drawing>
+      </w:r>
+    </w:p>
+    <w:p>
+      <w:pPr>
+        <w:pBdr>
+          <w:left w:val="single" w:sz="18" w:space="12" w:color="5B2A86"/>
+        </w:pBdr>
+        <w:shd w:val="clear" w:color="auto" w:fill="F4F0FA"/>
+        <w:spacing w:before="30" w:after="70"/>
+        <w:ind w:left="340" w:right="340"/>
+      </w:pPr>
+      <w:r>
+        <w:rPr>
+          <w:rFonts w:ascii="Georgia" w:hAnsi="Georgia" w:cs="Georgia"/>
+          <w:b w:val="0"/>
+          <w:i w:val="0"/>
+          <w:color w:val="222222"/>
+          <w:sz w:val="19"/>
+        </w:rPr>
+        <w:t xml:space="preserve">▶ </w:t>
+      </w:r>
+      <w:r>
+        <w:rPr>
+          <w:rFonts w:ascii="Georgia" w:hAnsi="Georgia" w:cs="Georgia"/>
+          <w:b/>
+          <w:i w:val="0"/>
+          <w:color w:val="222222"/>
+          <w:sz w:val="19"/>
+        </w:rPr>
+        <w:t>Cellar toys.</w:t>
+      </w:r>
+      <w:r>
+        <w:rPr>
+          <w:rFonts w:ascii="Georgia" w:hAnsi="Georgia" w:cs="Georgia"/>
+          <w:b w:val="0"/>
+          <w:i w:val="0"/>
+          <w:color w:val="222222"/>
+          <w:sz w:val="19"/>
+        </w:rPr>
+        <w:t xml:space="preserve"> Shove a shoulder-high cask down the tight aisle (once, Strength DC 12): 1d4 bludgeoning and prone to whatever fails a DC 12 Dexterity save. Pull down the rickety shelf (an Action): an adjacent creature makes a DC 13 Dexterity save or is restrained under broken wood until the end of its next turn.</w:t>
       </w:r>
     </w:p>
     <w:p>
@@ -1706,6 +1706,8 @@
     </w:p>
     <w:p>
       <w:pPr>
+        <w:keepNext/>
+        <w:keepLines/>
         <w:pBdr>
           <w:left w:val="double" w:sz="12" w:space="10" w:color="1F7A78"/>
           <w:right w:val="double" w:sz="12" w:space="10" w:color="1F7A78"/>
@@ -1727,6 +1729,8 @@
     </w:p>
     <w:p>
       <w:pPr>
+        <w:keepNext/>
+        <w:keepLines/>
         <w:pBdr>
           <w:left w:val="double" w:sz="12" w:space="10" w:color="1F7A78"/>
           <w:right w:val="double" w:sz="12" w:space="10" w:color="1F7A78"/>
@@ -1738,6 +1742,8 @@
     </w:p>
     <w:p>
       <w:pPr>
+        <w:keepNext/>
+        <w:keepLines/>
         <w:pBdr>
           <w:left w:val="double" w:sz="12" w:space="10" w:color="1F7A78"/>
           <w:right w:val="double" w:sz="12" w:space="10" w:color="1F7A78"/>
@@ -1809,6 +1815,8 @@
     </w:p>
     <w:p>
       <w:pPr>
+        <w:keepNext/>
+        <w:keepLines/>
         <w:pBdr>
           <w:left w:val="double" w:sz="12" w:space="10" w:color="1F7A78"/>
           <w:right w:val="double" w:sz="12" w:space="10" w:color="1F7A78"/>
@@ -1840,6 +1848,8 @@
     </w:p>
     <w:p>
       <w:pPr>
+        <w:keepNext/>
+        <w:keepLines/>
         <w:pBdr>
           <w:left w:val="double" w:sz="12" w:space="10" w:color="1F7A78"/>
           <w:right w:val="double" w:sz="12" w:space="10" w:color="1F7A78"/>
@@ -1871,6 +1881,8 @@
     </w:p>
     <w:p>
       <w:pPr>
+        <w:keepNext/>
+        <w:keepLines/>
         <w:pBdr>
           <w:left w:val="double" w:sz="12" w:space="10" w:color="1F7A78"/>
           <w:right w:val="double" w:sz="12" w:space="10" w:color="1F7A78"/>
@@ -1902,6 +1914,8 @@
     </w:p>
     <w:p>
       <w:pPr>
+        <w:keepNext/>
+        <w:keepLines/>
         <w:pBdr>
           <w:left w:val="double" w:sz="12" w:space="10" w:color="1F7A78"/>
           <w:right w:val="double" w:sz="12" w:space="10" w:color="1F7A78"/>
@@ -1913,6 +1927,7 @@
     </w:p>
     <w:p>
       <w:pPr>
+        <w:keepLines/>
         <w:pBdr>
           <w:bottom w:val="double" w:sz="12" w:space="4" w:color="1F7A78"/>
           <w:left w:val="double" w:sz="12" w:space="10" w:color="1F7A78"/>
@@ -2184,6 +2199,8 @@
     </w:p>
     <w:p>
       <w:pPr>
+        <w:keepNext/>
+        <w:keepLines/>
         <w:pBdr>
           <w:left w:val="double" w:sz="12" w:space="10" w:color="1F7A78"/>
           <w:right w:val="double" w:sz="12" w:space="10" w:color="1F7A78"/>
@@ -2205,6 +2222,8 @@
     </w:p>
     <w:p>
       <w:pPr>
+        <w:keepNext/>
+        <w:keepLines/>
         <w:pBdr>
           <w:left w:val="double" w:sz="12" w:space="10" w:color="1F7A78"/>
           <w:right w:val="double" w:sz="12" w:space="10" w:color="1F7A78"/>
@@ -2216,6 +2235,8 @@
     </w:p>
     <w:p>
       <w:pPr>
+        <w:keepNext/>
+        <w:keepLines/>
         <w:pBdr>
           <w:left w:val="double" w:sz="12" w:space="10" w:color="1F7A78"/>
           <w:right w:val="double" w:sz="12" w:space="10" w:color="1F7A78"/>
@@ -2247,6 +2268,8 @@
     </w:p>
     <w:p>
       <w:pPr>
+        <w:keepNext/>
+        <w:keepLines/>
         <w:pBdr>
           <w:left w:val="double" w:sz="12" w:space="10" w:color="1F7A78"/>
           <w:right w:val="double" w:sz="12" w:space="10" w:color="1F7A78"/>
@@ -2278,6 +2301,8 @@
     </w:p>
     <w:p>
       <w:pPr>
+        <w:keepNext/>
+        <w:keepLines/>
         <w:pBdr>
           <w:left w:val="double" w:sz="12" w:space="10" w:color="1F7A78"/>
           <w:right w:val="double" w:sz="12" w:space="10" w:color="1F7A78"/>
@@ -2309,6 +2334,8 @@
     </w:p>
     <w:p>
       <w:pPr>
+        <w:keepNext/>
+        <w:keepLines/>
         <w:pBdr>
           <w:left w:val="double" w:sz="12" w:space="10" w:color="1F7A78"/>
           <w:right w:val="double" w:sz="12" w:space="10" w:color="1F7A78"/>
@@ -2340,6 +2367,8 @@
     </w:p>
     <w:p>
       <w:pPr>
+        <w:keepNext/>
+        <w:keepLines/>
         <w:pBdr>
           <w:left w:val="double" w:sz="12" w:space="10" w:color="1F7A78"/>
           <w:right w:val="double" w:sz="12" w:space="10" w:color="1F7A78"/>
@@ -2351,6 +2380,8 @@
     </w:p>
     <w:p>
       <w:pPr>
+        <w:keepNext/>
+        <w:keepLines/>
         <w:pBdr>
           <w:left w:val="double" w:sz="12" w:space="10" w:color="1F7A78"/>
           <w:right w:val="double" w:sz="12" w:space="10" w:color="1F7A78"/>
@@ -2382,6 +2413,7 @@
     </w:p>
     <w:p>
       <w:pPr>
+        <w:keepLines/>
         <w:pBdr>
           <w:bottom w:val="double" w:sz="12" w:space="4" w:color="1F7A78"/>
           <w:left w:val="double" w:sz="12" w:space="10" w:color="1F7A78"/>
@@ -2942,6 +2974,8 @@
     </w:p>
     <w:p>
       <w:pPr>
+        <w:keepNext/>
+        <w:keepLines/>
         <w:pBdr>
           <w:left w:val="double" w:sz="12" w:space="10" w:color="1F7A78"/>
           <w:right w:val="double" w:sz="12" w:space="10" w:color="1F7A78"/>
@@ -2963,6 +2997,8 @@
     </w:p>
     <w:p>
       <w:pPr>
+        <w:keepNext/>
+        <w:keepLines/>
         <w:pBdr>
           <w:left w:val="double" w:sz="12" w:space="10" w:color="1F7A78"/>
           <w:right w:val="double" w:sz="12" w:space="10" w:color="1F7A78"/>
@@ -2974,6 +3010,8 @@
     </w:p>
     <w:p>
       <w:pPr>
+        <w:keepNext/>
+        <w:keepLines/>
         <w:pBdr>
           <w:left w:val="double" w:sz="12" w:space="10" w:color="1F7A78"/>
           <w:right w:val="double" w:sz="12" w:space="10" w:color="1F7A78"/>
@@ -3025,6 +3063,8 @@
     </w:p>
     <w:p>
       <w:pPr>
+        <w:keepNext/>
+        <w:keepLines/>
         <w:pBdr>
           <w:left w:val="double" w:sz="12" w:space="10" w:color="1F7A78"/>
           <w:right w:val="double" w:sz="12" w:space="10" w:color="1F7A78"/>
@@ -3076,6 +3116,8 @@
     </w:p>
     <w:p>
       <w:pPr>
+        <w:keepNext/>
+        <w:keepLines/>
         <w:pBdr>
           <w:left w:val="double" w:sz="12" w:space="10" w:color="1F7A78"/>
           <w:right w:val="double" w:sz="12" w:space="10" w:color="1F7A78"/>
@@ -3127,6 +3169,7 @@
     </w:p>
     <w:p>
       <w:pPr>
+        <w:keepLines/>
         <w:pBdr>
           <w:bottom w:val="double" w:sz="12" w:space="4" w:color="1F7A78"/>
           <w:left w:val="double" w:sz="12" w:space="10" w:color="1F7A78"/>

</xml_diff>

<commit_message>
S6 whitespace: departure vignette closes the chapter; undead cards get portraits
DM-approved art: the heroes walking east at sunrise (fills the 80
percent empty teaser page), plus spooky-cozy zombie and skeleton
portraits for the graveyard cards (fills the 60 percent page).

Co-Authored-By: Claude Opus 4.8 <noreply@anthropic.com>
</commit_message>
<xml_diff>
--- a/sessions/session_06_wraithpine.docx
+++ b/sessions/session_06_wraithpine.docx
@@ -5216,6 +5216,62 @@
     <w:p>
       <w:pPr>
         <w:keepNext/>
+        <w:spacing w:before="120" w:after="40"/>
+        <w:jc w:val="center"/>
+      </w:pPr>
+      <w:r>
+        <w:drawing>
+          <wp:inline xmlns:a="http://schemas.openxmlformats.org/drawingml/2006/main" xmlns:pic="http://schemas.openxmlformats.org/drawingml/2006/picture">
+            <wp:extent cx="5669280" cy="3779520"/>
+            <wp:docPr id="12" name="Picture 12"/>
+            <wp:cNvGraphicFramePr>
+              <a:graphicFrameLocks noChangeAspect="1"/>
+            </wp:cNvGraphicFramePr>
+            <a:graphic>
+              <a:graphicData uri="http://schemas.openxmlformats.org/drawingml/2006/picture">
+                <pic:pic>
+                  <pic:nvPicPr>
+                    <pic:cNvPr id="0" name="image.jpg"/>
+                    <pic:cNvPicPr/>
+                  </pic:nvPicPr>
+                  <pic:blipFill>
+                    <a:blip r:embed="rId21"/>
+                    <a:stretch>
+                      <a:fillRect/>
+                    </a:stretch>
+                  </pic:blipFill>
+                  <pic:spPr>
+                    <a:xfrm>
+                      <a:off x="0" y="0"/>
+                      <a:ext cx="5669280" cy="3779520"/>
+                    </a:xfrm>
+                    <a:prstGeom prst="rect"/>
+                  </pic:spPr>
+                </pic:pic>
+              </a:graphicData>
+            </a:graphic>
+          </wp:inline>
+        </w:drawing>
+      </w:r>
+    </w:p>
+    <w:p>
+      <w:pPr>
+        <w:spacing w:after="140"/>
+        <w:jc w:val="center"/>
+      </w:pPr>
+      <w:r>
+        <w:rPr>
+          <w:rFonts w:ascii="Georgia" w:hAnsi="Georgia" w:cs="Georgia"/>
+          <w:i/>
+          <w:color w:val="888888"/>
+          <w:sz w:val="18"/>
+        </w:rPr>
+        <w:t>East, toward Gearhaven: three heroes, three relics, and one small ghost-light friend.</w:t>
+      </w:r>
+    </w:p>
+    <w:p>
+      <w:pPr>
+        <w:keepNext/>
         <w:pageBreakBefore/>
         <w:spacing w:before="200" w:after="40"/>
         <w:jc w:val="center"/>
@@ -6763,7 +6819,7 @@
               <w:drawing>
                 <wp:inline xmlns:a="http://schemas.openxmlformats.org/drawingml/2006/main" xmlns:pic="http://schemas.openxmlformats.org/drawingml/2006/picture">
                   <wp:extent cx="2624328" cy="2624328"/>
-                  <wp:docPr id="12" name="Picture 12"/>
+                  <wp:docPr id="13" name="Picture 13"/>
                   <wp:cNvGraphicFramePr>
                     <a:graphicFrameLocks noChangeAspect="1"/>
                   </wp:cNvGraphicFramePr>
@@ -6775,7 +6831,7 @@
                           <pic:cNvPicPr/>
                         </pic:nvPicPr>
                         <pic:blipFill>
-                          <a:blip r:embed="rId21"/>
+                          <a:blip r:embed="rId22"/>
                           <a:stretch>
                             <a:fillRect/>
                           </a:stretch>
@@ -7282,7 +7338,7 @@
               <w:drawing>
                 <wp:inline xmlns:a="http://schemas.openxmlformats.org/drawingml/2006/main" xmlns:pic="http://schemas.openxmlformats.org/drawingml/2006/picture">
                   <wp:extent cx="2624328" cy="2624328"/>
-                  <wp:docPr id="13" name="Picture 13"/>
+                  <wp:docPr id="14" name="Picture 14"/>
                   <wp:cNvGraphicFramePr>
                     <a:graphicFrameLocks noChangeAspect="1"/>
                   </wp:cNvGraphicFramePr>
@@ -7294,7 +7350,7 @@
                           <pic:cNvPicPr/>
                         </pic:nvPicPr>
                         <pic:blipFill>
-                          <a:blip r:embed="rId22"/>
+                          <a:blip r:embed="rId23"/>
                           <a:stretch>
                             <a:fillRect/>
                           </a:stretch>
@@ -7805,6 +7861,46 @@
           </w:p>
           <w:p>
             <w:pPr>
+              <w:spacing w:after="60"/>
+              <w:jc w:val="center"/>
+            </w:pPr>
+            <w:r>
+              <w:drawing>
+                <wp:inline xmlns:a="http://schemas.openxmlformats.org/drawingml/2006/main" xmlns:pic="http://schemas.openxmlformats.org/drawingml/2006/picture">
+                  <wp:extent cx="2624328" cy="2624328"/>
+                  <wp:docPr id="15" name="Picture 15"/>
+                  <wp:cNvGraphicFramePr>
+                    <a:graphicFrameLocks noChangeAspect="1"/>
+                  </wp:cNvGraphicFramePr>
+                  <a:graphic>
+                    <a:graphicData uri="http://schemas.openxmlformats.org/drawingml/2006/picture">
+                      <pic:pic>
+                        <pic:nvPicPr>
+                          <pic:cNvPr id="0" name="image.jpg"/>
+                          <pic:cNvPicPr/>
+                        </pic:nvPicPr>
+                        <pic:blipFill>
+                          <a:blip r:embed="rId24"/>
+                          <a:stretch>
+                            <a:fillRect/>
+                          </a:stretch>
+                        </pic:blipFill>
+                        <pic:spPr>
+                          <a:xfrm>
+                            <a:off x="0" y="0"/>
+                            <a:ext cx="2624328" cy="2624328"/>
+                          </a:xfrm>
+                          <a:prstGeom prst="rect"/>
+                        </pic:spPr>
+                      </pic:pic>
+                    </a:graphicData>
+                  </a:graphic>
+                </wp:inline>
+              </w:drawing>
+            </w:r>
+          </w:p>
+          <w:p>
+            <w:pPr>
               <w:spacing w:after="20"/>
             </w:pPr>
             <w:r>
@@ -8185,6 +8281,46 @@
                 <w:sz w:val="16"/>
               </w:rPr>
               <w:t>Medium undead, unaligned ✦ CR 1/4 (50 XP) ✦ only if the rite is begun loud and careless</w:t>
+            </w:r>
+          </w:p>
+          <w:p>
+            <w:pPr>
+              <w:spacing w:after="60"/>
+              <w:jc w:val="center"/>
+            </w:pPr>
+            <w:r>
+              <w:drawing>
+                <wp:inline xmlns:a="http://schemas.openxmlformats.org/drawingml/2006/main" xmlns:pic="http://schemas.openxmlformats.org/drawingml/2006/picture">
+                  <wp:extent cx="2624328" cy="2624328"/>
+                  <wp:docPr id="16" name="Picture 16"/>
+                  <wp:cNvGraphicFramePr>
+                    <a:graphicFrameLocks noChangeAspect="1"/>
+                  </wp:cNvGraphicFramePr>
+                  <a:graphic>
+                    <a:graphicData uri="http://schemas.openxmlformats.org/drawingml/2006/picture">
+                      <pic:pic>
+                        <pic:nvPicPr>
+                          <pic:cNvPr id="0" name="image.jpg"/>
+                          <pic:cNvPicPr/>
+                        </pic:nvPicPr>
+                        <pic:blipFill>
+                          <a:blip r:embed="rId25"/>
+                          <a:stretch>
+                            <a:fillRect/>
+                          </a:stretch>
+                        </pic:blipFill>
+                        <pic:spPr>
+                          <a:xfrm>
+                            <a:off x="0" y="0"/>
+                            <a:ext cx="2624328" cy="2624328"/>
+                          </a:xfrm>
+                          <a:prstGeom prst="rect"/>
+                        </pic:spPr>
+                      </pic:pic>
+                    </a:graphicData>
+                  </a:graphic>
+                </wp:inline>
+              </w:drawing>
             </w:r>
           </w:p>
           <w:p>
@@ -8560,7 +8696,7 @@
               <w:drawing>
                 <wp:inline xmlns:a="http://schemas.openxmlformats.org/drawingml/2006/main" xmlns:pic="http://schemas.openxmlformats.org/drawingml/2006/picture">
                   <wp:extent cx="2743200" cy="2743200"/>
-                  <wp:docPr id="14" name="Picture 14"/>
+                  <wp:docPr id="17" name="Picture 17"/>
                   <wp:cNvGraphicFramePr>
                     <a:graphicFrameLocks noChangeAspect="1"/>
                   </wp:cNvGraphicFramePr>
@@ -8572,7 +8708,7 @@
                           <pic:cNvPicPr/>
                         </pic:nvPicPr>
                         <pic:blipFill>
-                          <a:blip r:embed="rId23"/>
+                          <a:blip r:embed="rId26"/>
                           <a:stretch>
                             <a:fillRect/>
                           </a:stretch>
@@ -9209,7 +9345,7 @@
               <w:drawing>
                 <wp:inline xmlns:a="http://schemas.openxmlformats.org/drawingml/2006/main" xmlns:pic="http://schemas.openxmlformats.org/drawingml/2006/picture">
                   <wp:extent cx="2011680" cy="2011680"/>
-                  <wp:docPr id="15" name="Picture 15"/>
+                  <wp:docPr id="18" name="Picture 18"/>
                   <wp:cNvGraphicFramePr>
                     <a:graphicFrameLocks noChangeAspect="1"/>
                   </wp:cNvGraphicFramePr>
@@ -9221,7 +9357,7 @@
                           <pic:cNvPicPr/>
                         </pic:nvPicPr>
                         <pic:blipFill>
-                          <a:blip r:embed="rId24"/>
+                          <a:blip r:embed="rId27"/>
                           <a:stretch>
                             <a:fillRect/>
                           </a:stretch>

</xml_diff>

<commit_message>
Session 6: bank approved v3 cellar swarm art
Replaces the off-tone cellar scene art with the approved v3 rats-only
swarm portrait (scruffy grey rats, battle-scarred torn-ear leader,
storybook tone). Used both as the cellar-fight scene float and, newly,
on the appendix "Swarm of Rats" stat card so that card is no longer
art-less. Prior character-scene art and its prompt retired to
_triage/superseded_art/. Manifest and gen_prompt filename reconciled.

Co-Authored-By: Claude Opus 4.8 <noreply@anthropic.com>
</commit_message>
<xml_diff>
--- a/sessions/session_06_wraithpine.docx
+++ b/sessions/session_06_wraithpine.docx
@@ -5924,6 +5924,46 @@
           </w:p>
           <w:p>
             <w:pPr>
+              <w:spacing w:after="60"/>
+              <w:jc w:val="center"/>
+            </w:pPr>
+            <w:r>
+              <w:drawing>
+                <wp:inline xmlns:a="http://schemas.openxmlformats.org/drawingml/2006/main" xmlns:pic="http://schemas.openxmlformats.org/drawingml/2006/picture">
+                  <wp:extent cx="2194560" cy="2194560"/>
+                  <wp:docPr id="13" name="Picture 13"/>
+                  <wp:cNvGraphicFramePr>
+                    <a:graphicFrameLocks noChangeAspect="1"/>
+                  </wp:cNvGraphicFramePr>
+                  <a:graphic>
+                    <a:graphicData uri="http://schemas.openxmlformats.org/drawingml/2006/picture">
+                      <pic:pic>
+                        <pic:nvPicPr>
+                          <pic:cNvPr id="0" name="image.jpg"/>
+                          <pic:cNvPicPr/>
+                        </pic:nvPicPr>
+                        <pic:blipFill>
+                          <a:blip r:embed="rId14"/>
+                          <a:stretch>
+                            <a:fillRect/>
+                          </a:stretch>
+                        </pic:blipFill>
+                        <pic:spPr>
+                          <a:xfrm>
+                            <a:off x="0" y="0"/>
+                            <a:ext cx="2194560" cy="2194560"/>
+                          </a:xfrm>
+                          <a:prstGeom prst="rect"/>
+                        </pic:spPr>
+                      </pic:pic>
+                    </a:graphicData>
+                  </a:graphic>
+                </wp:inline>
+              </w:drawing>
+            </w:r>
+          </w:p>
+          <w:p>
+            <w:pPr>
               <w:spacing w:after="20"/>
             </w:pPr>
             <w:r>
@@ -6910,7 +6950,7 @@
               <w:drawing>
                 <wp:inline xmlns:a="http://schemas.openxmlformats.org/drawingml/2006/main" xmlns:pic="http://schemas.openxmlformats.org/drawingml/2006/picture">
                   <wp:extent cx="2624328" cy="2624328"/>
-                  <wp:docPr id="13" name="Picture 13"/>
+                  <wp:docPr id="14" name="Picture 14"/>
                   <wp:cNvGraphicFramePr>
                     <a:graphicFrameLocks noChangeAspect="1"/>
                   </wp:cNvGraphicFramePr>
@@ -7429,7 +7469,7 @@
               <w:drawing>
                 <wp:inline xmlns:a="http://schemas.openxmlformats.org/drawingml/2006/main" xmlns:pic="http://schemas.openxmlformats.org/drawingml/2006/picture">
                   <wp:extent cx="2624328" cy="2624328"/>
-                  <wp:docPr id="14" name="Picture 14"/>
+                  <wp:docPr id="15" name="Picture 15"/>
                   <wp:cNvGraphicFramePr>
                     <a:graphicFrameLocks noChangeAspect="1"/>
                   </wp:cNvGraphicFramePr>
@@ -7954,7 +7994,7 @@
               <w:drawing>
                 <wp:inline xmlns:a="http://schemas.openxmlformats.org/drawingml/2006/main" xmlns:pic="http://schemas.openxmlformats.org/drawingml/2006/picture">
                   <wp:extent cx="2624328" cy="2624328"/>
-                  <wp:docPr id="15" name="Picture 15"/>
+                  <wp:docPr id="16" name="Picture 16"/>
                   <wp:cNvGraphicFramePr>
                     <a:graphicFrameLocks noChangeAspect="1"/>
                   </wp:cNvGraphicFramePr>
@@ -8378,7 +8418,7 @@
               <w:drawing>
                 <wp:inline xmlns:a="http://schemas.openxmlformats.org/drawingml/2006/main" xmlns:pic="http://schemas.openxmlformats.org/drawingml/2006/picture">
                   <wp:extent cx="2624328" cy="2624328"/>
-                  <wp:docPr id="16" name="Picture 16"/>
+                  <wp:docPr id="17" name="Picture 17"/>
                   <wp:cNvGraphicFramePr>
                     <a:graphicFrameLocks noChangeAspect="1"/>
                   </wp:cNvGraphicFramePr>
@@ -8785,7 +8825,7 @@
                   <wp:extent cx="2560320" cy="2560320"/>
                   <wp:effectExtent l="0" t="0" r="0" b="0"/>
                   <wp:wrapSquare wrapText="bothSides"/>
-                  <wp:docPr id="17" name="Picture 17"/>
+                  <wp:docPr id="18" name="Picture 18"/>
                   <wp:cNvGraphicFramePr/>
                   <a:graphic xmlns:pic="http://schemas.openxmlformats.org/drawingml/2006/picture">
                     <a:graphicData uri="http://schemas.openxmlformats.org/drawingml/2006/picture">
@@ -9430,7 +9470,7 @@
                   <wp:extent cx="2011680" cy="2011680"/>
                   <wp:effectExtent l="0" t="0" r="0" b="0"/>
                   <wp:wrapSquare wrapText="bothSides"/>
-                  <wp:docPr id="18" name="Picture 18"/>
+                  <wp:docPr id="19" name="Picture 19"/>
                   <wp:cNvGraphicFramePr/>
                   <a:graphic xmlns:pic="http://schemas.openxmlformats.org/drawingml/2006/picture">
                     <a:graphicData uri="http://schemas.openxmlformats.org/drawingml/2006/picture">

</xml_diff>